<commit_message>
Regenerate WORKING_GUIDE.docx (adds §4.9 connectors/drivers/environment); mermaid.ink fallback when kroki is down
</commit_message>
<xml_diff>
--- a/control_plane/docs/WORKING_GUIDE.docx
+++ b/control_plane/docs/WORKING_GUIDE.docx
@@ -38,7 +38,7 @@
       <w:r>
         <w:drawing>
           <wp:inline xmlns:a="http://schemas.openxmlformats.org/drawingml/2006/main" xmlns:pic="http://schemas.openxmlformats.org/drawingml/2006/picture">
-            <wp:extent cx="5669280" cy="1376935"/>
+            <wp:extent cx="5669280" cy="1396836"/>
             <wp:docPr id="1" name="Picture 1"/>
             <wp:cNvGraphicFramePr>
               <a:graphicFrameLocks noChangeAspect="1"/>
@@ -59,7 +59,7 @@
                   <pic:spPr>
                     <a:xfrm>
                       <a:off x="0" y="0"/>
-                      <a:ext cx="5669280" cy="1376935"/>
+                      <a:ext cx="5669280" cy="1396836"/>
                     </a:xfrm>
                     <a:prstGeom prst="rect"/>
                   </pic:spPr>
@@ -89,7 +89,7 @@
       <w:r>
         <w:drawing>
           <wp:inline xmlns:a="http://schemas.openxmlformats.org/drawingml/2006/main" xmlns:pic="http://schemas.openxmlformats.org/drawingml/2006/picture">
-            <wp:extent cx="5669280" cy="389595"/>
+            <wp:extent cx="5669280" cy="393038"/>
             <wp:docPr id="2" name="Picture 2"/>
             <wp:cNvGraphicFramePr>
               <a:graphicFrameLocks noChangeAspect="1"/>
@@ -110,7 +110,7 @@
                   <pic:spPr>
                     <a:xfrm>
                       <a:off x="0" y="0"/>
-                      <a:ext cx="5669280" cy="389595"/>
+                      <a:ext cx="5669280" cy="393038"/>
                     </a:xfrm>
                     <a:prstGeom prst="rect"/>
                   </pic:spPr>
@@ -1070,7 +1070,7 @@
       <w:r>
         <w:drawing>
           <wp:inline xmlns:a="http://schemas.openxmlformats.org/drawingml/2006/main" xmlns:pic="http://schemas.openxmlformats.org/drawingml/2006/picture">
-            <wp:extent cx="5669280" cy="21593609"/>
+            <wp:extent cx="5669280" cy="21495108"/>
             <wp:docPr id="3" name="Picture 3"/>
             <wp:cNvGraphicFramePr>
               <a:graphicFrameLocks noChangeAspect="1"/>
@@ -1091,7 +1091,7 @@
                   <pic:spPr>
                     <a:xfrm>
                       <a:off x="0" y="0"/>
-                      <a:ext cx="5669280" cy="21593609"/>
+                      <a:ext cx="5669280" cy="21495108"/>
                     </a:xfrm>
                     <a:prstGeom prst="rect"/>
                   </pic:spPr>
@@ -3058,6 +3058,317 @@
     <w:p/>
     <w:p>
       <w:pPr>
+        <w:pStyle w:val="Heading2"/>
+      </w:pPr>
+      <w:r>
+        <w:t>4.9 Ingestion connectors &amp; adding a source</w:t>
+      </w:r>
+    </w:p>
+    <w:p>
+      <w:r>
+        <w:t>Bronze ingestion is connector-dispatched: each datasource declares a `connector`, and bronze_worker calls the matching function from the registry in cp_framework (INGEST_CONNECTORS). A connector fetches the raw extract; apply_select shapes the landed schema; control columns are added; the row lands in bronze. Silver is source-agnostic, so a NEW SOURCE NEEDS ONLY CONFIG — no notebook/pipeline changes. Extend with register_ingest_connector(name, fn). Credentials are never stored in config (SQL/ODBC user+password are passed at run time).</w:t>
+      </w:r>
+    </w:p>
+    <w:tbl>
+      <w:tblPr>
+        <w:tblStyle w:val="LightGrid-Accent1"/>
+        <w:tblW w:type="auto" w:w="0"/>
+        <w:tblLook w:firstColumn="1" w:firstRow="1" w:lastColumn="0" w:lastRow="0" w:noHBand="0" w:noVBand="1" w:val="04A0"/>
+      </w:tblPr>
+      <w:tblGrid>
+        <w:gridCol w:w="2880"/>
+        <w:gridCol w:w="2880"/>
+        <w:gridCol w:w="2880"/>
+      </w:tblGrid>
+      <w:tr>
+        <w:tc>
+          <w:tcPr>
+            <w:tcW w:type="dxa" w:w="2880"/>
+          </w:tcPr>
+          <w:p>
+            <w:r>
+              <w:rPr>
+                <w:b/>
+              </w:rPr>
+              <w:t>connector</w:t>
+            </w:r>
+          </w:p>
+        </w:tc>
+        <w:tc>
+          <w:tcPr>
+            <w:tcW w:type="dxa" w:w="2880"/>
+          </w:tcPr>
+          <w:p>
+            <w:r>
+              <w:rPr>
+                <w:b/>
+              </w:rPr>
+              <w:t>Reads</w:t>
+            </w:r>
+          </w:p>
+        </w:tc>
+        <w:tc>
+          <w:tcPr>
+            <w:tcW w:type="dxa" w:w="2880"/>
+          </w:tcPr>
+          <w:p>
+            <w:r>
+              <w:rPr>
+                <w:b/>
+              </w:rPr>
+              <w:t>Driver / setup</w:t>
+            </w:r>
+          </w:p>
+        </w:tc>
+      </w:tr>
+      <w:tr>
+        <w:tc>
+          <w:tcPr>
+            <w:tcW w:type="dxa" w:w="2880"/>
+          </w:tcPr>
+          <w:p>
+            <w:r>
+              <w:t>sqlserver</w:t>
+            </w:r>
+          </w:p>
+        </w:tc>
+        <w:tc>
+          <w:tcPr>
+            <w:tcW w:type="dxa" w:w="2880"/>
+          </w:tcPr>
+          <w:p>
+            <w:r>
+              <w:t>SQL Server via Spark JDBC (complex types pruned; incremental watermark)</w:t>
+            </w:r>
+          </w:p>
+        </w:tc>
+        <w:tc>
+          <w:tcPr>
+            <w:tcW w:type="dxa" w:w="2880"/>
+          </w:tcPr>
+          <w:p>
+            <w:r>
+              <w:t>bundled — zero setup (validated)</w:t>
+            </w:r>
+          </w:p>
+        </w:tc>
+      </w:tr>
+      <w:tr>
+        <w:tc>
+          <w:tcPr>
+            <w:tcW w:type="dxa" w:w="2880"/>
+          </w:tcPr>
+          <w:p>
+            <w:r>
+              <w:t>postgresql / mysql</w:t>
+            </w:r>
+          </w:p>
+        </w:tc>
+        <w:tc>
+          <w:tcPr>
+            <w:tcW w:type="dxa" w:w="2880"/>
+          </w:tcPr>
+          <w:p>
+            <w:r>
+              <w:t>that dialect via Spark JDBC (distributed)</w:t>
+            </w:r>
+          </w:p>
+        </w:tc>
+        <w:tc>
+          <w:tcPr>
+            <w:tcW w:type="dxa" w:w="2880"/>
+          </w:tcPr>
+          <w:p>
+            <w:r>
+              <w:t>jar bundled in the Fabric runtime — zero setup</w:t>
+            </w:r>
+          </w:p>
+        </w:tc>
+      </w:tr>
+      <w:tr>
+        <w:tc>
+          <w:tcPr>
+            <w:tcW w:type="dxa" w:w="2880"/>
+          </w:tcPr>
+          <w:p>
+            <w:r>
+              <w:t>oracle / db2</w:t>
+            </w:r>
+          </w:p>
+        </w:tc>
+        <w:tc>
+          <w:tcPr>
+            <w:tcW w:type="dxa" w:w="2880"/>
+          </w:tcPr>
+          <w:p>
+            <w:r>
+              <w:t>default pure-Python driver-side (oracledb thin / ibm_db), self-installing; opt-in distributed JDBC via connection_json.mode=jdbc</w:t>
+            </w:r>
+          </w:p>
+        </w:tc>
+        <w:tc>
+          <w:tcPr>
+            <w:tcW w:type="dxa" w:w="2880"/>
+          </w:tcPr>
+          <w:p>
+            <w:r>
+              <w:t>plug-and-play (driver pip-installs on demand — validated); JDBC mode needs the ojdbc/db2jcc jar on an Environment</w:t>
+            </w:r>
+          </w:p>
+        </w:tc>
+      </w:tr>
+      <w:tr>
+        <w:tc>
+          <w:tcPr>
+            <w:tcW w:type="dxa" w:w="2880"/>
+          </w:tcPr>
+          <w:p>
+            <w:r>
+              <w:t>jdbc</w:t>
+            </w:r>
+          </w:p>
+        </w:tc>
+        <w:tc>
+          <w:tcPr>
+            <w:tcW w:type="dxa" w:w="2880"/>
+          </w:tcPr>
+          <w:p>
+            <w:r>
+              <w:t>any JDBC via explicit url+driver (connection_json)</w:t>
+            </w:r>
+          </w:p>
+        </w:tc>
+        <w:tc>
+          <w:tcPr>
+            <w:tcW w:type="dxa" w:w="2880"/>
+          </w:tcPr>
+          <w:p>
+            <w:r>
+              <w:t>needs that driver jar on an Environment</w:t>
+            </w:r>
+          </w:p>
+        </w:tc>
+      </w:tr>
+      <w:tr>
+        <w:tc>
+          <w:tcPr>
+            <w:tcW w:type="dxa" w:w="2880"/>
+          </w:tcPr>
+          <w:p>
+            <w:r>
+              <w:t>odbc</w:t>
+            </w:r>
+          </w:p>
+        </w:tc>
+        <w:tc>
+          <w:tcPr>
+            <w:tcW w:type="dxa" w:w="2880"/>
+          </w:tcPr>
+          <w:p>
+            <w:r>
+              <w:t>pyodbc on the driver node (modest volumes)</w:t>
+            </w:r>
+          </w:p>
+        </w:tc>
+        <w:tc>
+          <w:tcPr>
+            <w:tcW w:type="dxa" w:w="2880"/>
+          </w:tcPr>
+          <w:p>
+            <w:r>
+              <w:t>needs the ODBC driver/DSN</w:t>
+            </w:r>
+          </w:p>
+        </w:tc>
+      </w:tr>
+      <w:tr>
+        <w:tc>
+          <w:tcPr>
+            <w:tcW w:type="dxa" w:w="2880"/>
+          </w:tcPr>
+          <w:p>
+            <w:r>
+              <w:t>rest_api</w:t>
+            </w:r>
+          </w:p>
+        </w:tc>
+        <w:tc>
+          <w:tcPr>
+            <w:tcW w:type="dxa" w:w="2880"/>
+          </w:tcPr>
+          <w:p>
+            <w:r>
+              <w:t>generic REST/JSON (url/method/params/record_path in source_options_json)</w:t>
+            </w:r>
+          </w:p>
+        </w:tc>
+        <w:tc>
+          <w:tcPr>
+            <w:tcW w:type="dxa" w:w="2880"/>
+          </w:tcPr>
+          <w:p>
+            <w:r>
+              <w:t>zero setup</w:t>
+            </w:r>
+          </w:p>
+        </w:tc>
+      </w:tr>
+      <w:tr>
+        <w:tc>
+          <w:tcPr>
+            <w:tcW w:type="dxa" w:w="2880"/>
+          </w:tcPr>
+          <w:p>
+            <w:r>
+              <w:t>statcan_wds</w:t>
+            </w:r>
+          </w:p>
+        </w:tc>
+        <w:tc>
+          <w:tcPr>
+            <w:tcW w:type="dxa" w:w="2880"/>
+          </w:tcPr>
+          <w:p>
+            <w:r>
+              <w:t>Statistics Canada WDS full-table download</w:t>
+            </w:r>
+          </w:p>
+        </w:tc>
+        <w:tc>
+          <w:tcPr>
+            <w:tcW w:type="dxa" w:w="2880"/>
+          </w:tcPr>
+          <w:p>
+            <w:r>
+              <w:t>zero setup (validated)</w:t>
+            </w:r>
+          </w:p>
+        </w:tc>
+      </w:tr>
+    </w:tbl>
+    <w:p/>
+    <w:p>
+      <w:r>
+        <w:t>Driver availability — plug-and-play: SQL Server / Postgres / MySQL JDBC jars are already in the Fabric runtime (no setup). Oracle/DB2 have no bundled driver, so the connectors SELF-INSTALL their pure-Python driver (oracledb thin = no Oracle client; ibm_db = bundled client) on first use — still zero manual setup, reading driver-side (modest-moderate volumes). For DISTRIBUTED Spark JDBC on large Oracle/DB2 tables, set connection_json.mode=jdbc and supply the jar via a Fabric Environment: uncomment the environment block in deploy/manifest.yml and cp_bootstrap provisions+publishes it (cp_environment.py). Jars are proprietary — operator drops them in control_plane/deploy/jars/.</w:t>
+      </w:r>
+    </w:p>
+    <w:p>
+      <w:r>
+        <w:t>source_options_json (per object) carries: query (explicit extract SQL); filters ({column:value} equality filters applied AT INGEST to land a subset); select (SCHEMA SELECTION — control which columns land, their order/names/types; forms: ["a","b"] | [{source,name,type}] | {columns,rename,cast}); REST url/method/record_path; StatCan table_id/language/filters.</w:t>
+      </w:r>
+    </w:p>
+    <w:p>
+      <w:r>
+        <w:t>Landed-table naming: when target_name is null the bronze/silver table is derived as {source_name}_{source_schema|dbo}_{source_table}[_{suffix}] — e.g. source stats_can, schema null-&gt;dbo, table labour_force, suffix bc -&gt; stats_can_dbo_labour_force_bc.</w:t>
+      </w:r>
+    </w:p>
+    <w:p>
+      <w:r>
+        <w:t>Worked example — a Statistics Canada subset, CONFIG ONLY: datasource (source_id 2, connector statcan_wds, load_group 2) + source_object (table_id 14100287, filters GEO=British Columbia / Gender=Total - Gender / Statistics=Estimate / Data type=Seasonally adjusted, key [REF_DATE,VECTOR], suffix bc, select a controlled column set with VALUE cast to double) + steps for load group 2. The full table is ~5.4M rows; the filters land only the 32,724-row BC slice as stats_can_dbo_labour_force_bc. Non-SQL-Server connectors are skipped by metadata_worker (no INFORMATION_SCHEMA).</w:t>
+      </w:r>
+    </w:p>
+    <w:p>
+      <w:pPr>
         <w:pStyle w:val="Heading1"/>
       </w:pPr>
       <w:r>

</xml_diff>

<commit_message>
datasource.source_id -> IDENTITY (auto-assign; deterministic across envs)
source_id was inserted by hand, risking duplicate PKs. It is now an
IDENTITY(1,1) column: manual datasource inserts auto-assign a unique id
(use SCOPE_IDENTITY() for the source_object FK). Config-as-code promotion
stays deterministic — cp_config wraps IDENTITY tables (cp_sqldb.IDENTITY_
TABLES) in SET IDENTITY_INSERT so the ids captured in YAML replay
identically into every environment.

SQL Server can't ALTER a column to IDENTITY, so cp_sqldb.ensure_schema
rebuilds the (tiny) datasource table when needed — preserving existing
ids via IDENTITY_INSERT and re-creating the source_object FK. Idempotent
(skips if already IDENTITY). Applied and validated on DEV/UAT/PROD: ids
preserved (AdventureWorks=1, stats_can=2), FK intact, a hand insert
auto-assigns the next id, and cp_config reload keeps ids stable.

Docs: RUNBOOK §3 + WORKING_GUIDE §4.1/§4.9 use the SCOPE_IDENTITY pattern;
.docx regenerated.
</commit_message>
<xml_diff>
--- a/control_plane/docs/WORKING_GUIDE.docx
+++ b/control_plane/docs/WORKING_GUIDE.docx
@@ -38,7 +38,7 @@
       <w:r>
         <w:drawing>
           <wp:inline xmlns:a="http://schemas.openxmlformats.org/drawingml/2006/main" xmlns:pic="http://schemas.openxmlformats.org/drawingml/2006/picture">
-            <wp:extent cx="5669280" cy="1396836"/>
+            <wp:extent cx="5669280" cy="1376935"/>
             <wp:docPr id="1" name="Picture 1"/>
             <wp:cNvGraphicFramePr>
               <a:graphicFrameLocks noChangeAspect="1"/>
@@ -59,7 +59,7 @@
                   <pic:spPr>
                     <a:xfrm>
                       <a:off x="0" y="0"/>
-                      <a:ext cx="5669280" cy="1396836"/>
+                      <a:ext cx="5669280" cy="1376935"/>
                     </a:xfrm>
                     <a:prstGeom prst="rect"/>
                   </pic:spPr>
@@ -1070,7 +1070,7 @@
       <w:r>
         <w:drawing>
           <wp:inline xmlns:a="http://schemas.openxmlformats.org/drawingml/2006/main" xmlns:pic="http://schemas.openxmlformats.org/drawingml/2006/picture">
-            <wp:extent cx="5669280" cy="21495108"/>
+            <wp:extent cx="5669280" cy="21593609"/>
             <wp:docPr id="3" name="Picture 3"/>
             <wp:cNvGraphicFramePr>
               <a:graphicFrameLocks noChangeAspect="1"/>
@@ -1091,7 +1091,7 @@
                   <pic:spPr>
                     <a:xfrm>
                       <a:off x="0" y="0"/>
-                      <a:ext cx="5669280" cy="21495108"/>
+                      <a:ext cx="5669280" cy="21593609"/>
                     </a:xfrm>
                     <a:prstGeom prst="rect"/>
                   </pic:spPr>
@@ -1238,7 +1238,7 @@
       <w:r>
         <w:drawing>
           <wp:inline xmlns:a="http://schemas.openxmlformats.org/drawingml/2006/main" xmlns:pic="http://schemas.openxmlformats.org/drawingml/2006/picture">
-            <wp:extent cx="5669280" cy="2475099"/>
+            <wp:extent cx="5669280" cy="2518499"/>
             <wp:docPr id="5" name="Picture 5"/>
             <wp:cNvGraphicFramePr>
               <a:graphicFrameLocks noChangeAspect="1"/>
@@ -1259,7 +1259,7 @@
                   <pic:spPr>
                     <a:xfrm>
                       <a:off x="0" y="0"/>
-                      <a:ext cx="5669280" cy="2475099"/>
+                      <a:ext cx="5669280" cy="2518499"/>
                     </a:xfrm>
                     <a:prstGeom prst="rect"/>
                   </pic:spPr>
@@ -2784,7 +2784,7 @@
       <w:r>
         <w:drawing>
           <wp:inline xmlns:a="http://schemas.openxmlformats.org/drawingml/2006/main" xmlns:pic="http://schemas.openxmlformats.org/drawingml/2006/picture">
-            <wp:extent cx="5669280" cy="6002767"/>
+            <wp:extent cx="5669280" cy="6136459"/>
             <wp:docPr id="6" name="Picture 6"/>
             <wp:cNvGraphicFramePr>
               <a:graphicFrameLocks noChangeAspect="1"/>
@@ -2805,7 +2805,7 @@
                   <pic:spPr>
                     <a:xfrm>
                       <a:off x="0" y="0"/>
-                      <a:ext cx="5669280" cy="6002767"/>
+                      <a:ext cx="5669280" cy="6136459"/>
                     </a:xfrm>
                     <a:prstGeom prst="rect"/>
                   </pic:spPr>
@@ -3606,7 +3606,7 @@
       <w:r>
         <w:drawing>
           <wp:inline xmlns:a="http://schemas.openxmlformats.org/drawingml/2006/main" xmlns:pic="http://schemas.openxmlformats.org/drawingml/2006/picture">
-            <wp:extent cx="5669280" cy="857041"/>
+            <wp:extent cx="5669280" cy="862286"/>
             <wp:docPr id="7" name="Picture 7"/>
             <wp:cNvGraphicFramePr>
               <a:graphicFrameLocks noChangeAspect="1"/>
@@ -3627,7 +3627,7 @@
                   <pic:spPr>
                     <a:xfrm>
                       <a:off x="0" y="0"/>
-                      <a:ext cx="5669280" cy="857041"/>
+                      <a:ext cx="5669280" cy="862286"/>
                     </a:xfrm>
                     <a:prstGeom prst="rect"/>
                   </pic:spPr>

</xml_diff>

<commit_message>
Docs: generalized HTTP connector, KV secret_name, discovery, IDENTITY
WORKING_GUIDE §4.1/4.2/4.9 + RUNBOOK_statcan updated for the latest model:
- one generalized `http` connector (json/csv/zip_csv response modes);
  statcan_wds/rest_api/api are aliases. StatCan = params, not a connector.
- datasource.secret_name -> KV holds the complete connection; only the
  name is in config. connection_json = non-secret overrides only.
- objects are DISCOVERED (metadata step registers is_active=0), not
  hand-authored; object_id auto-derived.
- source_id is IDENTITY (SCOPE_IDENTITY for the FK).
RUNBOOK §4 rewritten to the generic http source_options (url/params/
response:zip_csv/filters/select). docx regenerated.
</commit_message>
<xml_diff>
--- a/control_plane/docs/WORKING_GUIDE.docx
+++ b/control_plane/docs/WORKING_GUIDE.docx
@@ -38,7 +38,7 @@
       <w:r>
         <w:drawing>
           <wp:inline xmlns:a="http://schemas.openxmlformats.org/drawingml/2006/main" xmlns:pic="http://schemas.openxmlformats.org/drawingml/2006/picture">
-            <wp:extent cx="5669280" cy="1376935"/>
+            <wp:extent cx="5669280" cy="1396836"/>
             <wp:docPr id="1" name="Picture 1"/>
             <wp:cNvGraphicFramePr>
               <a:graphicFrameLocks noChangeAspect="1"/>
@@ -59,7 +59,7 @@
                   <pic:spPr>
                     <a:xfrm>
                       <a:off x="0" y="0"/>
-                      <a:ext cx="5669280" cy="1376935"/>
+                      <a:ext cx="5669280" cy="1396836"/>
                     </a:xfrm>
                     <a:prstGeom prst="rect"/>
                   </pic:spPr>
@@ -1070,7 +1070,7 @@
       <w:r>
         <w:drawing>
           <wp:inline xmlns:a="http://schemas.openxmlformats.org/drawingml/2006/main" xmlns:pic="http://schemas.openxmlformats.org/drawingml/2006/picture">
-            <wp:extent cx="5669280" cy="21593609"/>
+            <wp:extent cx="5669280" cy="21495108"/>
             <wp:docPr id="3" name="Picture 3"/>
             <wp:cNvGraphicFramePr>
               <a:graphicFrameLocks noChangeAspect="1"/>
@@ -1091,7 +1091,7 @@
                   <pic:spPr>
                     <a:xfrm>
                       <a:off x="0" y="0"/>
-                      <a:ext cx="5669280" cy="21593609"/>
+                      <a:ext cx="5669280" cy="21495108"/>
                     </a:xfrm>
                     <a:prstGeom prst="rect"/>
                   </pic:spPr>
@@ -1121,7 +1121,7 @@
       <w:r>
         <w:drawing>
           <wp:inline xmlns:a="http://schemas.openxmlformats.org/drawingml/2006/main" xmlns:pic="http://schemas.openxmlformats.org/drawingml/2006/picture">
-            <wp:extent cx="5669280" cy="1682028"/>
+            <wp:extent cx="5669280" cy="1683825"/>
             <wp:docPr id="4" name="Picture 4"/>
             <wp:cNvGraphicFramePr>
               <a:graphicFrameLocks noChangeAspect="1"/>
@@ -1142,7 +1142,7 @@
                   <pic:spPr>
                     <a:xfrm>
                       <a:off x="0" y="0"/>
-                      <a:ext cx="5669280" cy="1682028"/>
+                      <a:ext cx="5669280" cy="1683825"/>
                     </a:xfrm>
                     <a:prstGeom prst="rect"/>
                   </pic:spPr>
@@ -1238,7 +1238,7 @@
       <w:r>
         <w:drawing>
           <wp:inline xmlns:a="http://schemas.openxmlformats.org/drawingml/2006/main" xmlns:pic="http://schemas.openxmlformats.org/drawingml/2006/picture">
-            <wp:extent cx="5669280" cy="2518499"/>
+            <wp:extent cx="5669280" cy="2475099"/>
             <wp:docPr id="5" name="Picture 5"/>
             <wp:cNvGraphicFramePr>
               <a:graphicFrameLocks noChangeAspect="1"/>
@@ -1259,7 +1259,7 @@
                   <pic:spPr>
                     <a:xfrm>
                       <a:off x="0" y="0"/>
-                      <a:ext cx="5669280" cy="2518499"/>
+                      <a:ext cx="5669280" cy="2475099"/>
                     </a:xfrm>
                     <a:prstGeom prst="rect"/>
                   </pic:spPr>
@@ -2784,7 +2784,7 @@
       <w:r>
         <w:drawing>
           <wp:inline xmlns:a="http://schemas.openxmlformats.org/drawingml/2006/main" xmlns:pic="http://schemas.openxmlformats.org/drawingml/2006/picture">
-            <wp:extent cx="5669280" cy="6136459"/>
+            <wp:extent cx="5669280" cy="6002767"/>
             <wp:docPr id="6" name="Picture 6"/>
             <wp:cNvGraphicFramePr>
               <a:graphicFrameLocks noChangeAspect="1"/>
@@ -2805,7 +2805,7 @@
                   <pic:spPr>
                     <a:xfrm>
                       <a:off x="0" y="0"/>
-                      <a:ext cx="5669280" cy="6136459"/>
+                      <a:ext cx="5669280" cy="6002767"/>
                     </a:xfrm>
                     <a:prstGeom prst="rect"/>
                   </pic:spPr>

</xml_diff>

<commit_message>
Docs: schema-enabled naming + §4.10 data security/governance (CLS/RLS/DDM/mask)
</commit_message>
<xml_diff>
--- a/control_plane/docs/WORKING_GUIDE.docx
+++ b/control_plane/docs/WORKING_GUIDE.docx
@@ -38,7 +38,7 @@
       <w:r>
         <w:drawing>
           <wp:inline xmlns:a="http://schemas.openxmlformats.org/drawingml/2006/main" xmlns:pic="http://schemas.openxmlformats.org/drawingml/2006/picture">
-            <wp:extent cx="5669280" cy="1396836"/>
+            <wp:extent cx="5669280" cy="1376935"/>
             <wp:docPr id="1" name="Picture 1"/>
             <wp:cNvGraphicFramePr>
               <a:graphicFrameLocks noChangeAspect="1"/>
@@ -59,7 +59,7 @@
                   <pic:spPr>
                     <a:xfrm>
                       <a:off x="0" y="0"/>
-                      <a:ext cx="5669280" cy="1396836"/>
+                      <a:ext cx="5669280" cy="1376935"/>
                     </a:xfrm>
                     <a:prstGeom prst="rect"/>
                   </pic:spPr>
@@ -89,7 +89,7 @@
       <w:r>
         <w:drawing>
           <wp:inline xmlns:a="http://schemas.openxmlformats.org/drawingml/2006/main" xmlns:pic="http://schemas.openxmlformats.org/drawingml/2006/picture">
-            <wp:extent cx="5669280" cy="393038"/>
+            <wp:extent cx="5669280" cy="389595"/>
             <wp:docPr id="2" name="Picture 2"/>
             <wp:cNvGraphicFramePr>
               <a:graphicFrameLocks noChangeAspect="1"/>
@@ -110,7 +110,7 @@
                   <pic:spPr>
                     <a:xfrm>
                       <a:off x="0" y="0"/>
-                      <a:ext cx="5669280" cy="393038"/>
+                      <a:ext cx="5669280" cy="389595"/>
                     </a:xfrm>
                     <a:prstGeom prst="rect"/>
                   </pic:spPr>
@@ -1070,7 +1070,7 @@
       <w:r>
         <w:drawing>
           <wp:inline xmlns:a="http://schemas.openxmlformats.org/drawingml/2006/main" xmlns:pic="http://schemas.openxmlformats.org/drawingml/2006/picture">
-            <wp:extent cx="5669280" cy="21495108"/>
+            <wp:extent cx="5669280" cy="21593609"/>
             <wp:docPr id="3" name="Picture 3"/>
             <wp:cNvGraphicFramePr>
               <a:graphicFrameLocks noChangeAspect="1"/>
@@ -1091,7 +1091,7 @@
                   <pic:spPr>
                     <a:xfrm>
                       <a:off x="0" y="0"/>
-                      <a:ext cx="5669280" cy="21495108"/>
+                      <a:ext cx="5669280" cy="21593609"/>
                     </a:xfrm>
                     <a:prstGeom prst="rect"/>
                   </pic:spPr>
@@ -1121,7 +1121,7 @@
       <w:r>
         <w:drawing>
           <wp:inline xmlns:a="http://schemas.openxmlformats.org/drawingml/2006/main" xmlns:pic="http://schemas.openxmlformats.org/drawingml/2006/picture">
-            <wp:extent cx="5669280" cy="1683825"/>
+            <wp:extent cx="5669280" cy="1682028"/>
             <wp:docPr id="4" name="Picture 4"/>
             <wp:cNvGraphicFramePr>
               <a:graphicFrameLocks noChangeAspect="1"/>
@@ -1142,7 +1142,7 @@
                   <pic:spPr>
                     <a:xfrm>
                       <a:off x="0" y="0"/>
-                      <a:ext cx="5669280" cy="1683825"/>
+                      <a:ext cx="5669280" cy="1682028"/>
                     </a:xfrm>
                     <a:prstGeom prst="rect"/>
                   </pic:spPr>
@@ -3606,7 +3606,7 @@
       <w:r>
         <w:drawing>
           <wp:inline xmlns:a="http://schemas.openxmlformats.org/drawingml/2006/main" xmlns:pic="http://schemas.openxmlformats.org/drawingml/2006/picture">
-            <wp:extent cx="5669280" cy="862286"/>
+            <wp:extent cx="5669280" cy="857041"/>
             <wp:docPr id="7" name="Picture 7"/>
             <wp:cNvGraphicFramePr>
               <a:graphicFrameLocks noChangeAspect="1"/>
@@ -3627,7 +3627,7 @@
                   <pic:spPr>
                     <a:xfrm>
                       <a:off x="0" y="0"/>
-                      <a:ext cx="5669280" cy="862286"/>
+                      <a:ext cx="5669280" cy="857041"/>
                     </a:xfrm>
                     <a:prstGeom prst="rect"/>
                   </pic:spPr>

</xml_diff>

<commit_message>
Docs: drop source_server refs (connections in KV); note connection builder registers datasource
</commit_message>
<xml_diff>
--- a/control_plane/docs/WORKING_GUIDE.docx
+++ b/control_plane/docs/WORKING_GUIDE.docx
@@ -38,7 +38,7 @@
       <w:r>
         <w:drawing>
           <wp:inline xmlns:a="http://schemas.openxmlformats.org/drawingml/2006/main" xmlns:pic="http://schemas.openxmlformats.org/drawingml/2006/picture">
-            <wp:extent cx="5669280" cy="1376935"/>
+            <wp:extent cx="5669280" cy="1396836"/>
             <wp:docPr id="1" name="Picture 1"/>
             <wp:cNvGraphicFramePr>
               <a:graphicFrameLocks noChangeAspect="1"/>
@@ -59,7 +59,7 @@
                   <pic:spPr>
                     <a:xfrm>
                       <a:off x="0" y="0"/>
-                      <a:ext cx="5669280" cy="1376935"/>
+                      <a:ext cx="5669280" cy="1396836"/>
                     </a:xfrm>
                     <a:prstGeom prst="rect"/>
                   </pic:spPr>
@@ -89,7 +89,7 @@
       <w:r>
         <w:drawing>
           <wp:inline xmlns:a="http://schemas.openxmlformats.org/drawingml/2006/main" xmlns:pic="http://schemas.openxmlformats.org/drawingml/2006/picture">
-            <wp:extent cx="5669280" cy="389595"/>
+            <wp:extent cx="5669280" cy="393038"/>
             <wp:docPr id="2" name="Picture 2"/>
             <wp:cNvGraphicFramePr>
               <a:graphicFrameLocks noChangeAspect="1"/>
@@ -110,7 +110,7 @@
                   <pic:spPr>
                     <a:xfrm>
                       <a:off x="0" y="0"/>
-                      <a:ext cx="5669280" cy="389595"/>
+                      <a:ext cx="5669280" cy="393038"/>
                     </a:xfrm>
                     <a:prstGeom prst="rect"/>
                   </pic:spPr>
@@ -1070,7 +1070,7 @@
       <w:r>
         <w:drawing>
           <wp:inline xmlns:a="http://schemas.openxmlformats.org/drawingml/2006/main" xmlns:pic="http://schemas.openxmlformats.org/drawingml/2006/picture">
-            <wp:extent cx="5669280" cy="21593609"/>
+            <wp:extent cx="5669280" cy="21495108"/>
             <wp:docPr id="3" name="Picture 3"/>
             <wp:cNvGraphicFramePr>
               <a:graphicFrameLocks noChangeAspect="1"/>
@@ -1091,7 +1091,7 @@
                   <pic:spPr>
                     <a:xfrm>
                       <a:off x="0" y="0"/>
-                      <a:ext cx="5669280" cy="21593609"/>
+                      <a:ext cx="5669280" cy="21495108"/>
                     </a:xfrm>
                     <a:prstGeom prst="rect"/>
                   </pic:spPr>
@@ -1121,7 +1121,7 @@
       <w:r>
         <w:drawing>
           <wp:inline xmlns:a="http://schemas.openxmlformats.org/drawingml/2006/main" xmlns:pic="http://schemas.openxmlformats.org/drawingml/2006/picture">
-            <wp:extent cx="5669280" cy="1682028"/>
+            <wp:extent cx="5669280" cy="1683825"/>
             <wp:docPr id="4" name="Picture 4"/>
             <wp:cNvGraphicFramePr>
               <a:graphicFrameLocks noChangeAspect="1"/>
@@ -1142,7 +1142,7 @@
                   <pic:spPr>
                     <a:xfrm>
                       <a:off x="0" y="0"/>
-                      <a:ext cx="5669280" cy="1682028"/>
+                      <a:ext cx="5669280" cy="1683825"/>
                     </a:xfrm>
                     <a:prstGeom prst="rect"/>
                   </pic:spPr>
@@ -1238,7 +1238,7 @@
       <w:r>
         <w:drawing>
           <wp:inline xmlns:a="http://schemas.openxmlformats.org/drawingml/2006/main" xmlns:pic="http://schemas.openxmlformats.org/drawingml/2006/picture">
-            <wp:extent cx="5669280" cy="2475099"/>
+            <wp:extent cx="5669280" cy="2518499"/>
             <wp:docPr id="5" name="Picture 5"/>
             <wp:cNvGraphicFramePr>
               <a:graphicFrameLocks noChangeAspect="1"/>
@@ -1259,7 +1259,7 @@
                   <pic:spPr>
                     <a:xfrm>
                       <a:off x="0" y="0"/>
-                      <a:ext cx="5669280" cy="2475099"/>
+                      <a:ext cx="5669280" cy="2518499"/>
                     </a:xfrm>
                     <a:prstGeom prst="rect"/>
                   </pic:spPr>
@@ -2784,7 +2784,7 @@
       <w:r>
         <w:drawing>
           <wp:inline xmlns:a="http://schemas.openxmlformats.org/drawingml/2006/main" xmlns:pic="http://schemas.openxmlformats.org/drawingml/2006/picture">
-            <wp:extent cx="5669280" cy="6002767"/>
+            <wp:extent cx="5669280" cy="6136459"/>
             <wp:docPr id="6" name="Picture 6"/>
             <wp:cNvGraphicFramePr>
               <a:graphicFrameLocks noChangeAspect="1"/>
@@ -2805,7 +2805,7 @@
                   <pic:spPr>
                     <a:xfrm>
                       <a:off x="0" y="0"/>
-                      <a:ext cx="5669280" cy="6002767"/>
+                      <a:ext cx="5669280" cy="6136459"/>
                     </a:xfrm>
                     <a:prstGeom prst="rect"/>
                   </pic:spPr>
@@ -3606,7 +3606,7 @@
       <w:r>
         <w:drawing>
           <wp:inline xmlns:a="http://schemas.openxmlformats.org/drawingml/2006/main" xmlns:pic="http://schemas.openxmlformats.org/drawingml/2006/picture">
-            <wp:extent cx="5669280" cy="857041"/>
+            <wp:extent cx="5669280" cy="862286"/>
             <wp:docPr id="7" name="Picture 7"/>
             <wp:cNvGraphicFramePr>
               <a:graphicFrameLocks noChangeAspect="1"/>
@@ -3627,7 +3627,7 @@
                   <pic:spPr>
                     <a:xfrm>
                       <a:off x="0" y="0"/>
-                      <a:ext cx="5669280" cy="857041"/>
+                      <a:ext cx="5669280" cy="862286"/>
                     </a:xfrm>
                     <a:prstGeom prst="rect"/>
                   </pic:spPr>

</xml_diff>

<commit_message>
discovery: add DB2 / Oracle / PostgreSQL / MySQL object discoverers
Adds @discoverer coverage for db2 (SYSCAT), oracle (ALL_TABLES/ALL_CONS_COLUMNS), and
postgresql+mysql (ANSI INFORMATION_SCHEMA) — each enumerates base tables + primary keys and
registers source_object rows (is_active=0), like the existing SQL Server discoverer. New shared
run_catalog_query() in connectors/base routes catalog reads through the SAME connection path each
connector uses (DB-API for oracle/db2 thin mode, JDBC otherwise); shared _candidates() shapes the
results. Removed the unused/misleading DISCOVERABLE_CONNECTORS set (the discovery registry is the
source of truth). Untested against live DB2/Oracle/PG/MySQL — needs a smoke test on first connect.

Also adds the private-OCI Fabric reference architecture diagrams (framework + mirroring variants).
</commit_message>
<xml_diff>
--- a/control_plane/docs/WORKING_GUIDE.docx
+++ b/control_plane/docs/WORKING_GUIDE.docx
@@ -11810,7 +11810,106 @@
     </w:p>
     <w:p>
       <w:r>
-        <w:t>filters/select and activate. SQL Server: every base table (+ keys from the PK). HTTP: one object per</w:t>
+        <w:t>filters/select and activate. Per connector — every base table + its primary key:</w:t>
+      </w:r>
+    </w:p>
+    <w:p>
+      <w:r>
+        <w:rPr>
+          <w:b/>
+        </w:rPr>
+        <w:t>SQL Server</w:t>
+      </w:r>
+      <w:r>
+        <w:t xml:space="preserve"> (</w:t>
+      </w:r>
+      <w:r>
+        <w:rPr>
+          <w:rFonts w:ascii="Consolas" w:hAnsi="Consolas"/>
+          <w:color w:val="A31F34"/>
+        </w:rPr>
+        <w:t>INFORMATION_SCHEMA</w:t>
+      </w:r>
+      <w:r>
+        <w:t xml:space="preserve">), </w:t>
+      </w:r>
+      <w:r>
+        <w:rPr>
+          <w:b/>
+        </w:rPr>
+        <w:t>PostgreSQL / MySQL</w:t>
+      </w:r>
+      <w:r>
+        <w:t xml:space="preserve"> (</w:t>
+      </w:r>
+      <w:r>
+        <w:rPr>
+          <w:rFonts w:ascii="Consolas" w:hAnsi="Consolas"/>
+          <w:color w:val="A31F34"/>
+        </w:rPr>
+        <w:t>INFORMATION_SCHEMA</w:t>
+      </w:r>
+      <w:r>
+        <w:t xml:space="preserve">), </w:t>
+      </w:r>
+      <w:r>
+        <w:rPr>
+          <w:b/>
+        </w:rPr>
+        <w:t>DB2</w:t>
+      </w:r>
+    </w:p>
+    <w:p>
+      <w:r>
+        <w:t>(</w:t>
+      </w:r>
+      <w:r>
+        <w:rPr>
+          <w:rFonts w:ascii="Consolas" w:hAnsi="Consolas"/>
+          <w:color w:val="A31F34"/>
+        </w:rPr>
+        <w:t>SYSCAT</w:t>
+      </w:r>
+      <w:r>
+        <w:t xml:space="preserve">), </w:t>
+      </w:r>
+      <w:r>
+        <w:rPr>
+          <w:b/>
+        </w:rPr>
+        <w:t>Oracle</w:t>
+      </w:r>
+      <w:r>
+        <w:t xml:space="preserve"> (</w:t>
+      </w:r>
+      <w:r>
+        <w:rPr>
+          <w:rFonts w:ascii="Consolas" w:hAnsi="Consolas"/>
+          <w:color w:val="A31F34"/>
+        </w:rPr>
+        <w:t>ALL_TABLES</w:t>
+      </w:r>
+      <w:r>
+        <w:t>/</w:t>
+      </w:r>
+      <w:r>
+        <w:rPr>
+          <w:rFonts w:ascii="Consolas" w:hAnsi="Consolas"/>
+          <w:color w:val="A31F34"/>
+        </w:rPr>
+        <w:t>ALL_CONS_COLUMNS</w:t>
+      </w:r>
+      <w:r>
+        <w:t xml:space="preserve">); </w:t>
+      </w:r>
+      <w:r>
+        <w:rPr>
+          <w:b/>
+        </w:rPr>
+        <w:t>HTTP</w:t>
+      </w:r>
+      <w:r>
+        <w:t>: one object per</w:t>
       </w:r>
     </w:p>
     <w:p>
@@ -11822,10 +11921,35 @@
         <w:t>table_id</w:t>
       </w:r>
       <w:r>
-        <w:t>/resource declared in the datasource. So the flow is: register the *datasource* → run</w:t>
+        <w:t xml:space="preserve">/resource declared in the datasource. Each discoverer is one file in </w:t>
+      </w:r>
+      <w:r>
+        <w:rPr>
+          <w:rFonts w:ascii="Consolas" w:hAnsi="Consolas"/>
+          <w:color w:val="A31F34"/>
+        </w:rPr>
+        <w:t>src/cp/discovery/</w:t>
+      </w:r>
+      <w:r>
+        <w:t>,</w:t>
       </w:r>
     </w:p>
     <w:p>
+      <w:r>
+        <w:t>auto-registered by connector name — a connector *without* one still loads, you just author its</w:t>
+      </w:r>
+    </w:p>
+    <w:p>
+      <w:r>
+        <w:rPr>
+          <w:rFonts w:ascii="Consolas" w:hAnsi="Consolas"/>
+          <w:color w:val="A31F34"/>
+        </w:rPr>
+        <w:t>source_object</w:t>
+      </w:r>
+      <w:r>
+        <w:t xml:space="preserve"> rows by hand. So the flow is: register the *datasource* → run </w:t>
+      </w:r>
       <w:r>
         <w:rPr>
           <w:rFonts w:ascii="Consolas" w:hAnsi="Consolas"/>
@@ -11834,7 +11958,12 @@
         <w:t>cp_pl_metadata</w:t>
       </w:r>
       <w:r>
-        <w:t xml:space="preserve"> → tweak + activate the object → run </w:t>
+        <w:t xml:space="preserve"> →</w:t>
+      </w:r>
+    </w:p>
+    <w:p>
+      <w:r>
+        <w:t xml:space="preserve">tweak + activate the object → run </w:t>
       </w:r>
       <w:r>
         <w:rPr>
@@ -11854,10 +11983,8 @@
         <w:t>source_id</w:t>
       </w:r>
       <w:r>
-        <w:t xml:space="preserve"> is</w:t>
-      </w:r>
-    </w:p>
-    <w:p>
+        <w:t xml:space="preserve"> is </w:t>
+      </w:r>
       <w:r>
         <w:rPr>
           <w:rFonts w:ascii="Consolas" w:hAnsi="Consolas"/>
@@ -11866,8 +11993,10 @@
         <w:t>IDENTITY</w:t>
       </w:r>
       <w:r>
-        <w:t xml:space="preserve"> (auto); use </w:t>
-      </w:r>
+        <w:t xml:space="preserve"> (auto); use</w:t>
+      </w:r>
+    </w:p>
+    <w:p>
       <w:r>
         <w:rPr>
           <w:rFonts w:ascii="Consolas" w:hAnsi="Consolas"/>
@@ -11877,6 +12006,40 @@
       </w:r>
       <w:r>
         <w:t xml:space="preserve"> if you ever insert a datasource by hand.</w:t>
+      </w:r>
+    </w:p>
+    <w:p>
+      <w:r>
+        <w:t>&gt; Object discovery (enumerate tables + PKs) now covers SQL Server, PostgreSQL, MySQL, DB2, and</w:t>
+      </w:r>
+    </w:p>
+    <w:p>
+      <w:r>
+        <w:t xml:space="preserve">&gt; Oracle. The separate per-object </w:t>
+      </w:r>
+      <w:r>
+        <w:rPr>
+          <w:b/>
+        </w:rPr>
+        <w:t>column-drift snapshot</w:t>
+      </w:r>
+      <w:r>
+        <w:t xml:space="preserve"> (§ </w:t>
+      </w:r>
+      <w:r>
+        <w:rPr>
+          <w:rFonts w:ascii="Consolas" w:hAnsi="Consolas"/>
+          <w:color w:val="A31F34"/>
+        </w:rPr>
+        <w:t>source_column</w:t>
+      </w:r>
+      <w:r>
+        <w:t>) currently runs for</w:t>
+      </w:r>
+    </w:p>
+    <w:p>
+      <w:r>
+        <w:t>&gt; SQL Server only; other engines discover + load, but don't yet get the column-drift baseline.</w:t>
       </w:r>
     </w:p>
     <w:p>

</xml_diff>